<commit_message>
feat: lab2 client pov
Co-Authored-By: Claude Opus 5.5 <noreply@anthropic.com>
</commit_message>
<xml_diff>
--- a/Lab2/Отчет_Задание2_Вариант13_Автосервис.docx
+++ b/Lab2/Отчет_Задание2_Вариант13_Автосервис.docx
@@ -2130,7 +2130,7 @@
           <w:i w:val="0"/>
           <w:sz w:val="28"/>
         </w:rPr>
-        <w:t xml:space="preserve"> вариант 13 «Автосервис». Основной бизнес-процесс, выделенный в работе №1, – «Обслуживание заказа клиента автосервиса». Его функциональная модель IDEF0 включает пять блоков: A1 «Принять заявку и зарегистрировать клиента», A2 «Спланировать работы и назначить исполнителя», A3 «Выполнить ремонтные работы», A4 «Рассчитать стоимость, принять оплату, выдать квитанцию», A5 «Сформировать отчётность».</w:t>
+        <w:t xml:space="preserve"> вариант 13 «Автосервис». Основной бизнес-процесс, выделенный в работе №1, – «Обслуживание заказа клиента автосервиса». Его функциональная модель IDEF0 включает пять блоков: A1 «Принять заявку и зарегистрировать клиента», A2 «Спланировать работы и назначить исполнителя», A3 «Выполнить ремонтные работы», A4 «Рассчитать стоимость, принять оплату, выдать квитанцию», A5 «Сформировать отчётность». Кроме того, в работе №1 построена модель IDEF0 с точки зрения клиента «Получить обслуживание автомобиля в автосервисе» из четырёх блоков: A1 «Записаться на обслуживание», A2 «Сдать автомобиль и согласовать работы», A3 «Отслеживать ход ремонта, согласовать доп. работы», A4 «Оплатить работы и получить автомобиль».</w:t>
       </w:r>
     </w:p>
     <w:p>
@@ -3461,6 +3461,160 @@
                 <w:sz w:val="22"/>
               </w:rPr>
               <w:t>«Заявка», «Заказ-наряд», «БД клиентов и заказов»</w:t>
+            </w:r>
+          </w:p>
+        </w:tc>
+      </w:tr>
+      <w:tr>
+        <w:trPr>
+          <w:cantSplit/>
+        </w:trPr>
+        <w:tc>
+          <w:tcPr>
+            <w:tcW w:type="dxa" w:w="2268"/>
+            <w:vAlign w:val="top"/>
+          </w:tcPr>
+          <w:p>
+            <w:pPr>
+              <w:keepNext w:val="0"/>
+              <w:spacing w:line="240" w:lineRule="auto" w:before="0" w:after="0"/>
+              <w:ind w:firstLine="0"/>
+              <w:jc w:val="left"/>
+            </w:pPr>
+            <w:r/>
+            <w:r>
+              <w:rPr>
+                <w:rFonts w:ascii="Times New Roman" w:hAnsi="Times New Roman" w:cs="Times New Roman" w:eastAsia="Times New Roman"/>
+                <w:b w:val="0"/>
+                <w:i w:val="0"/>
+                <w:sz w:val="22"/>
+              </w:rPr>
+              <w:t>Событие-ссылка (link)</w:t>
+            </w:r>
+          </w:p>
+        </w:tc>
+        <w:tc>
+          <w:tcPr>
+            <w:tcW w:type="dxa" w:w="3798"/>
+            <w:vAlign w:val="top"/>
+          </w:tcPr>
+          <w:p>
+            <w:pPr>
+              <w:keepNext w:val="0"/>
+              <w:spacing w:line="240" w:lineRule="auto" w:before="0" w:after="0"/>
+              <w:ind w:firstLine="0"/>
+              <w:jc w:val="left"/>
+            </w:pPr>
+            <w:r/>
+            <w:r>
+              <w:rPr>
+                <w:rFonts w:ascii="Times New Roman" w:hAnsi="Times New Roman" w:cs="Times New Roman" w:eastAsia="Times New Roman"/>
+                <w:b w:val="0"/>
+                <w:i w:val="0"/>
+                <w:sz w:val="22"/>
+              </w:rPr>
+              <w:t>Переход между частями одной диаграммы, размещёнными на разных листах</w:t>
+            </w:r>
+          </w:p>
+        </w:tc>
+        <w:tc>
+          <w:tcPr>
+            <w:tcW w:type="dxa" w:w="3288"/>
+            <w:vAlign w:val="top"/>
+          </w:tcPr>
+          <w:p>
+            <w:pPr>
+              <w:keepNext w:val="0"/>
+              <w:spacing w:line="240" w:lineRule="auto" w:before="0" w:after="0"/>
+              <w:ind w:firstLine="0"/>
+              <w:jc w:val="left"/>
+            </w:pPr>
+            <w:r/>
+            <w:r>
+              <w:rPr>
+                <w:rFonts w:ascii="Times New Roman" w:hAnsi="Times New Roman" w:cs="Times New Roman" w:eastAsia="Times New Roman"/>
+                <w:b w:val="0"/>
+                <w:i w:val="0"/>
+                <w:sz w:val="22"/>
+              </w:rPr>
+              <w:t>«Переход к A3» – «Из A2» (рисунки 8, 9)</w:t>
+            </w:r>
+          </w:p>
+        </w:tc>
+      </w:tr>
+      <w:tr>
+        <w:trPr>
+          <w:cantSplit/>
+        </w:trPr>
+        <w:tc>
+          <w:tcPr>
+            <w:tcW w:type="dxa" w:w="2268"/>
+            <w:vAlign w:val="top"/>
+          </w:tcPr>
+          <w:p>
+            <w:pPr>
+              <w:keepNext w:val="0"/>
+              <w:spacing w:line="240" w:lineRule="auto" w:before="0" w:after="0"/>
+              <w:ind w:firstLine="0"/>
+              <w:jc w:val="left"/>
+            </w:pPr>
+            <w:r/>
+            <w:r>
+              <w:rPr>
+                <w:rFonts w:ascii="Times New Roman" w:hAnsi="Times New Roman" w:cs="Times New Roman" w:eastAsia="Times New Roman"/>
+                <w:b w:val="0"/>
+                <w:i w:val="0"/>
+                <w:sz w:val="22"/>
+              </w:rPr>
+              <w:t>Группа</w:t>
+            </w:r>
+          </w:p>
+        </w:tc>
+        <w:tc>
+          <w:tcPr>
+            <w:tcW w:type="dxa" w:w="3798"/>
+            <w:vAlign w:val="top"/>
+          </w:tcPr>
+          <w:p>
+            <w:pPr>
+              <w:keepNext w:val="0"/>
+              <w:spacing w:line="240" w:lineRule="auto" w:before="0" w:after="0"/>
+              <w:ind w:firstLine="0"/>
+              <w:jc w:val="left"/>
+            </w:pPr>
+            <w:r/>
+            <w:r>
+              <w:rPr>
+                <w:rFonts w:ascii="Times New Roman" w:hAnsi="Times New Roman" w:cs="Times New Roman" w:eastAsia="Times New Roman"/>
+                <w:b w:val="0"/>
+                <w:i w:val="0"/>
+                <w:sz w:val="22"/>
+              </w:rPr>
+              <w:t>Визуальное объединение элементов без влияния на ход процесса</w:t>
+            </w:r>
+          </w:p>
+        </w:tc>
+        <w:tc>
+          <w:tcPr>
+            <w:tcW w:type="dxa" w:w="3288"/>
+            <w:vAlign w:val="top"/>
+          </w:tcPr>
+          <w:p>
+            <w:pPr>
+              <w:keepNext w:val="0"/>
+              <w:spacing w:line="240" w:lineRule="auto" w:before="0" w:after="0"/>
+              <w:ind w:firstLine="0"/>
+              <w:jc w:val="left"/>
+            </w:pPr>
+            <w:r/>
+            <w:r>
+              <w:rPr>
+                <w:rFonts w:ascii="Times New Roman" w:hAnsi="Times New Roman" w:cs="Times New Roman" w:eastAsia="Times New Roman"/>
+                <w:b w:val="0"/>
+                <w:i w:val="0"/>
+                <w:sz w:val="22"/>
+              </w:rPr>
+              <w:t>Блоки A1–A4 модели клиента</w:t>
             </w:r>
           </w:p>
         </w:tc>
@@ -5899,6 +6053,356 @@
     <w:p>
       <w:pPr>
         <w:keepNext/>
+        <w:spacing w:line="360" w:lineRule="auto" w:before="120" w:after="120"/>
+        <w:ind w:firstLine="709"/>
+        <w:jc w:val="left"/>
+        <w:outlineLvl w:val="1"/>
+      </w:pPr>
+      <w:r>
+        <w:rPr>
+          <w:rFonts w:ascii="Times New Roman" w:hAnsi="Times New Roman" w:cs="Times New Roman" w:eastAsia="Times New Roman"/>
+          <w:b/>
+          <w:i w:val="0"/>
+          <w:sz w:val="28"/>
+        </w:rPr>
+        <w:t>3.6 Модель процесса с точки зрения клиента</w:t>
+      </w:r>
+    </w:p>
+    <w:p>
+      <w:pPr>
+        <w:keepNext w:val="0"/>
+        <w:spacing w:line="360" w:lineRule="auto" w:before="0" w:after="0"/>
+        <w:ind w:firstLine="709"/>
+        <w:jc w:val="both"/>
+      </w:pPr>
+      <w:r>
+        <w:rPr>
+          <w:rFonts w:ascii="Times New Roman" w:hAnsi="Times New Roman" w:cs="Times New Roman" w:eastAsia="Times New Roman"/>
+          <w:b w:val="0"/>
+          <w:i w:val="0"/>
+          <w:sz w:val="28"/>
+        </w:rPr>
+        <w:t>Модели, рассмотренные выше, описывают процесс с точки зрения автосервиса (руководителя). Чтобы учесть требования клиента, по модели IDEF0 «Получить обслуживание автомобиля в автосервисе» из работы №1 построена BPMN-модель процесса клиента. Здесь раскрыт пул «Клиент», а автосервис и его информационная система показаны свёрнутыми пулами, с которыми клиент обменивается сообщениями. Из-за большого числа элементов модель разделена на две диаграммы, связанные событиями-ссылками (link). Блоки диаграммы A0 клиента выделены группами.</w:t>
+      </w:r>
+    </w:p>
+    <w:p>
+      <w:pPr>
+        <w:keepNext w:val="0"/>
+        <w:spacing w:line="360" w:lineRule="auto" w:before="0" w:after="0"/>
+        <w:ind w:firstLine="709"/>
+        <w:jc w:val="both"/>
+      </w:pPr>
+      <w:r>
+        <w:rPr>
+          <w:rFonts w:ascii="Times New Roman" w:hAnsi="Times New Roman" w:cs="Times New Roman" w:eastAsia="Times New Roman"/>
+          <w:b w:val="0"/>
+          <w:i w:val="0"/>
+          <w:sz w:val="28"/>
+        </w:rPr>
+        <w:t>На рисунке 8 показаны блоки A1 и A2. Процесс клиента запускается двумя способами: клиент сам понимает, что нужен ремонт, или получает от ИС SMS-напоминание о плановом ТО. Клиент записывается онлайн или по телефону и ожидает подтверждения записи, а затем дня визита (таймерное событие). В автосервисе клиент сдаёт автомобиль и согласует перечень работ, стоимость и срок. Если условия не устраивают, процесс завершается отказом от обслуживания; иначе клиент подписывает заказ-наряд и акт приёма.</w:t>
+      </w:r>
+    </w:p>
+    <w:p>
+      <w:pPr>
+        <w:sectPr>
+          <w:pgSz w:w="11906" w:h="16838"/>
+          <w:pgMar w:top="1134" w:right="850" w:bottom="1134" w:left="1701" w:header="708" w:footer="708" w:gutter="0"/>
+          <w:cols w:space="708"/>
+          <w:titlePg/>
+          <w:docGrid w:linePitch="381"/>
+        </w:sectPr>
+      </w:pPr>
+    </w:p>
+    <w:p>
+      <w:pPr>
+        <w:keepNext/>
+        <w:spacing w:line="240" w:lineRule="auto" w:before="0" w:after="0"/>
+        <w:ind w:firstLine="0"/>
+        <w:jc w:val="center"/>
+      </w:pPr>
+      <w:r>
+        <w:drawing>
+          <wp:inline xmlns:a="http://schemas.openxmlformats.org/drawingml/2006/main" xmlns:pic="http://schemas.openxmlformats.org/drawingml/2006/picture">
+            <wp:extent cx="9000000" cy="3626866"/>
+            <wp:docPr id="9" name="Picture 9"/>
+            <wp:cNvGraphicFramePr>
+              <a:graphicFrameLocks noChangeAspect="1"/>
+            </wp:cNvGraphicFramePr>
+            <a:graphic>
+              <a:graphicData uri="http://schemas.openxmlformats.org/drawingml/2006/picture">
+                <pic:pic>
+                  <pic:nvPicPr>
+                    <pic:cNvPr id="0" name="bpmn_client_1.png"/>
+                    <pic:cNvPicPr/>
+                  </pic:nvPicPr>
+                  <pic:blipFill>
+                    <a:blip r:embed="rId17"/>
+                    <a:stretch>
+                      <a:fillRect/>
+                    </a:stretch>
+                  </pic:blipFill>
+                  <pic:spPr>
+                    <a:xfrm>
+                      <a:off x="0" y="0"/>
+                      <a:ext cx="9000000" cy="3626866"/>
+                    </a:xfrm>
+                    <a:prstGeom prst="rect"/>
+                  </pic:spPr>
+                </pic:pic>
+              </a:graphicData>
+            </a:graphic>
+          </wp:inline>
+        </w:drawing>
+      </w:r>
+    </w:p>
+    <w:p>
+      <w:pPr>
+        <w:keepNext w:val="0"/>
+        <w:spacing w:line="360" w:lineRule="auto" w:before="0" w:after="120"/>
+        <w:ind w:firstLine="0"/>
+        <w:jc w:val="center"/>
+      </w:pPr>
+      <w:r>
+        <w:rPr>
+          <w:rFonts w:ascii="Times New Roman" w:hAnsi="Times New Roman" w:cs="Times New Roman" w:eastAsia="Times New Roman"/>
+          <w:b w:val="0"/>
+          <w:i w:val="0"/>
+          <w:sz w:val="28"/>
+        </w:rPr>
+        <w:t>Рисунок 8 – Модель процесса клиента: A1 «Записаться на обслуживание» и A2 «Сдать автомобиль и согласовать работы»</w:t>
+      </w:r>
+    </w:p>
+    <w:p>
+      <w:pPr>
+        <w:sectPr>
+          <w:pgSz w:w="16838" w:h="11906" w:orient="landscape"/>
+          <w:pgMar w:top="850" w:right="1134" w:bottom="850" w:left="1134" w:header="708" w:footer="708" w:gutter="0"/>
+          <w:cols w:space="708"/>
+          <w:titlePg/>
+          <w:docGrid w:linePitch="381"/>
+        </w:sectPr>
+      </w:pPr>
+    </w:p>
+    <w:p>
+      <w:pPr>
+        <w:keepNext w:val="0"/>
+        <w:spacing w:line="360" w:lineRule="auto" w:before="0" w:after="0"/>
+        <w:ind w:firstLine="709"/>
+        <w:jc w:val="both"/>
+      </w:pPr>
+      <w:r>
+        <w:rPr>
+          <w:rFonts w:ascii="Times New Roman" w:hAnsi="Times New Roman" w:cs="Times New Roman" w:eastAsia="Times New Roman"/>
+          <w:b w:val="0"/>
+          <w:i w:val="0"/>
+          <w:sz w:val="28"/>
+        </w:rPr>
+        <w:t>На рисунке 9 показаны блоки A3 и A4. Пока автомобиль в ремонте, клиент ожидает одно из двух событий (событийный шлюз): запрос на согласование дополнительных работ или SMS о готовности. Запрос на доп. работы клиент рассматривает и сообщает решение, после чего снова ожидает событий. Получив сообщение о готовности, клиент приезжает и проверяет квитанцию; при ошибке он запрашивает исправление. Затем клиент оплачивает работы и получает автомобиль, документы и электронную копию квитанции. ИС сохраняет историю обслуживания, по которой позже отправит напоминание о следующем ТО – так замыкается цикл с начальным событием на рисунке 8.</w:t>
+      </w:r>
+    </w:p>
+    <w:p>
+      <w:pPr>
+        <w:sectPr>
+          <w:pgSz w:w="11906" w:h="16838"/>
+          <w:pgMar w:top="1134" w:right="850" w:bottom="1134" w:left="1701" w:header="708" w:footer="708" w:gutter="0"/>
+          <w:cols w:space="708"/>
+          <w:titlePg/>
+          <w:docGrid w:linePitch="381"/>
+        </w:sectPr>
+      </w:pPr>
+    </w:p>
+    <w:p>
+      <w:pPr>
+        <w:keepNext/>
+        <w:spacing w:line="240" w:lineRule="auto" w:before="0" w:after="0"/>
+        <w:ind w:firstLine="0"/>
+        <w:jc w:val="center"/>
+      </w:pPr>
+      <w:r>
+        <w:drawing>
+          <wp:inline xmlns:a="http://schemas.openxmlformats.org/drawingml/2006/main" xmlns:pic="http://schemas.openxmlformats.org/drawingml/2006/picture">
+            <wp:extent cx="9000000" cy="3626866"/>
+            <wp:docPr id="10" name="Picture 10"/>
+            <wp:cNvGraphicFramePr>
+              <a:graphicFrameLocks noChangeAspect="1"/>
+            </wp:cNvGraphicFramePr>
+            <a:graphic>
+              <a:graphicData uri="http://schemas.openxmlformats.org/drawingml/2006/picture">
+                <pic:pic>
+                  <pic:nvPicPr>
+                    <pic:cNvPr id="0" name="bpmn_client_2.png"/>
+                    <pic:cNvPicPr/>
+                  </pic:nvPicPr>
+                  <pic:blipFill>
+                    <a:blip r:embed="rId18"/>
+                    <a:stretch>
+                      <a:fillRect/>
+                    </a:stretch>
+                  </pic:blipFill>
+                  <pic:spPr>
+                    <a:xfrm>
+                      <a:off x="0" y="0"/>
+                      <a:ext cx="9000000" cy="3626866"/>
+                    </a:xfrm>
+                    <a:prstGeom prst="rect"/>
+                  </pic:spPr>
+                </pic:pic>
+              </a:graphicData>
+            </a:graphic>
+          </wp:inline>
+        </w:drawing>
+      </w:r>
+    </w:p>
+    <w:p>
+      <w:pPr>
+        <w:keepNext w:val="0"/>
+        <w:spacing w:line="360" w:lineRule="auto" w:before="0" w:after="120"/>
+        <w:ind w:firstLine="0"/>
+        <w:jc w:val="center"/>
+      </w:pPr>
+      <w:r>
+        <w:rPr>
+          <w:rFonts w:ascii="Times New Roman" w:hAnsi="Times New Roman" w:cs="Times New Roman" w:eastAsia="Times New Roman"/>
+          <w:b w:val="0"/>
+          <w:i w:val="0"/>
+          <w:sz w:val="28"/>
+        </w:rPr>
+        <w:t>Рисунок 9 – Модель процесса клиента: A3 «Отслеживать ход ремонта, согласовать доп. работы» и A4 «Оплатить работы и получить автомобиль»</w:t>
+      </w:r>
+    </w:p>
+    <w:p>
+      <w:pPr>
+        <w:sectPr>
+          <w:pgSz w:w="16838" w:h="11906" w:orient="landscape"/>
+          <w:pgMar w:top="850" w:right="1134" w:bottom="850" w:left="1134" w:header="708" w:footer="708" w:gutter="0"/>
+          <w:cols w:space="708"/>
+          <w:titlePg/>
+          <w:docGrid w:linePitch="381"/>
+        </w:sectPr>
+      </w:pPr>
+    </w:p>
+    <w:p>
+      <w:pPr>
+        <w:keepNext w:val="0"/>
+        <w:spacing w:line="360" w:lineRule="auto" w:before="0" w:after="0"/>
+        <w:ind w:firstLine="709"/>
+        <w:jc w:val="both"/>
+      </w:pPr>
+      <w:r>
+        <w:rPr>
+          <w:rFonts w:ascii="Times New Roman" w:hAnsi="Times New Roman" w:cs="Times New Roman" w:eastAsia="Times New Roman"/>
+          <w:b/>
+          <w:i w:val="0"/>
+          <w:sz w:val="28"/>
+        </w:rPr>
+        <w:t>Выявленные уточнения:</w:t>
+      </w:r>
+    </w:p>
+    <w:p>
+      <w:pPr>
+        <w:keepNext w:val="0"/>
+        <w:spacing w:line="360" w:lineRule="auto" w:before="0" w:after="0"/>
+        <w:ind w:firstLine="709"/>
+        <w:jc w:val="both"/>
+      </w:pPr>
+      <w:r>
+        <w:rPr>
+          <w:rFonts w:ascii="Times New Roman" w:hAnsi="Times New Roman" w:cs="Times New Roman" w:eastAsia="Times New Roman"/>
+          <w:b w:val="0"/>
+          <w:i w:val="0"/>
+          <w:sz w:val="28"/>
+        </w:rPr>
+        <w:t>– поток сообщений «Заявка на запись» и ветка «Онлайн» требуют онлайн-записи на свободное время с SMS-подтверждением (F-31);</w:t>
+      </w:r>
+    </w:p>
+    <w:p>
+      <w:pPr>
+        <w:keepNext w:val="0"/>
+        <w:spacing w:line="360" w:lineRule="auto" w:before="0" w:after="0"/>
+        <w:ind w:firstLine="709"/>
+        <w:jc w:val="both"/>
+      </w:pPr>
+      <w:r>
+        <w:rPr>
+          <w:rFonts w:ascii="Times New Roman" w:hAnsi="Times New Roman" w:cs="Times New Roman" w:eastAsia="Times New Roman"/>
+          <w:b w:val="0"/>
+          <w:i w:val="0"/>
+          <w:sz w:val="28"/>
+        </w:rPr>
+        <w:t>– таймерное событие «День визита» показывает, что между записью и визитом проходит время; клиенту нужно напоминание о визите (F-32);</w:t>
+      </w:r>
+    </w:p>
+    <w:p>
+      <w:pPr>
+        <w:keepNext w:val="0"/>
+        <w:spacing w:line="360" w:lineRule="auto" w:before="0" w:after="0"/>
+        <w:ind w:firstLine="709"/>
+        <w:jc w:val="both"/>
+      </w:pPr>
+      <w:r>
+        <w:rPr>
+          <w:rFonts w:ascii="Times New Roman" w:hAnsi="Times New Roman" w:cs="Times New Roman" w:eastAsia="Times New Roman"/>
+          <w:b w:val="0"/>
+          <w:i w:val="0"/>
+          <w:sz w:val="28"/>
+        </w:rPr>
+        <w:t>– начальное событие-сообщение «Напоминание о ТО» означает, что ИС должна сама отправлять напоминание, а не только формировать список клиентов (изменение F-15, приоритет повышен);</w:t>
+      </w:r>
+    </w:p>
+    <w:p>
+      <w:pPr>
+        <w:keepNext w:val="0"/>
+        <w:spacing w:line="360" w:lineRule="auto" w:before="0" w:after="0"/>
+        <w:ind w:firstLine="709"/>
+        <w:jc w:val="both"/>
+      </w:pPr>
+      <w:r>
+        <w:rPr>
+          <w:rFonts w:ascii="Times New Roman" w:hAnsi="Times New Roman" w:cs="Times New Roman" w:eastAsia="Times New Roman"/>
+          <w:b w:val="0"/>
+          <w:i w:val="0"/>
+          <w:sz w:val="28"/>
+        </w:rPr>
+        <w:t>– задача «Принять решение, сообщить мастеру» выполняется вне автосервиса, поэтому клиенту нужно отвечать на запрос о доп. работах прямо из SMS (F-33);</w:t>
+      </w:r>
+    </w:p>
+    <w:p>
+      <w:pPr>
+        <w:keepNext w:val="0"/>
+        <w:spacing w:line="360" w:lineRule="auto" w:before="0" w:after="0"/>
+        <w:ind w:firstLine="709"/>
+        <w:jc w:val="both"/>
+      </w:pPr>
+      <w:r>
+        <w:rPr>
+          <w:rFonts w:ascii="Times New Roman" w:hAnsi="Times New Roman" w:cs="Times New Roman" w:eastAsia="Times New Roman"/>
+          <w:b w:val="0"/>
+          <w:i w:val="0"/>
+          <w:sz w:val="28"/>
+        </w:rPr>
+        <w:t>– поток сообщений «Электронная квитанция» выявил потребность в электронной копии квитанции и чека (F-34); проверка квитанции клиентом подтверждает требования к полноте расчёта (F-28);</w:t>
+      </w:r>
+    </w:p>
+    <w:p>
+      <w:pPr>
+        <w:keepNext w:val="0"/>
+        <w:spacing w:line="360" w:lineRule="auto" w:before="0" w:after="0"/>
+        <w:ind w:firstLine="709"/>
+        <w:jc w:val="both"/>
+      </w:pPr>
+      <w:r>
+        <w:rPr>
+          <w:rFonts w:ascii="Times New Roman" w:hAnsi="Times New Roman" w:cs="Times New Roman" w:eastAsia="Times New Roman"/>
+          <w:b w:val="0"/>
+          <w:i w:val="0"/>
+          <w:sz w:val="28"/>
+        </w:rPr>
+        <w:t>– событие «Отказ от обслуживания» подтверждает требование F-20 о фиксации отказов.</w:t>
+      </w:r>
+    </w:p>
+    <w:p>
+      <w:pPr>
+        <w:keepNext/>
         <w:spacing w:line="360" w:lineRule="auto" w:before="240" w:after="120"/>
         <w:ind w:firstLine="0"/>
         <w:jc w:val="center"/>
@@ -5928,7 +6432,7 @@
           <w:i w:val="0"/>
           <w:sz w:val="28"/>
         </w:rPr>
-        <w:t>По результатам анализа BPMN-моделей в спецификацию требований, разработанную в работе №1, внесены изменения: добавлено 15 новых требований и изменено 6 существующих. Перечень изменений с указанием элемента модели, из которого они выявлены, приведён в таблице 3.</w:t>
+        <w:t>По результатам анализа BPMN-моделей в спецификацию требований, разработанную в работе №1, внесены изменения: добавлено 19 новых требований и изменено 7 существующих. Перечень изменений с указанием элемента модели, из которого они выявлены, приведён в таблице 3.</w:t>
       </w:r>
     </w:p>
     <w:p>
@@ -6503,7 +7007,7 @@
                 <w:i w:val="0"/>
                 <w:sz w:val="22"/>
               </w:rPr>
-              <w:t>F-16</w:t>
+              <w:t>F-15</w:t>
             </w:r>
           </w:p>
         </w:tc>
@@ -6551,7 +7055,7 @@
                 <w:i w:val="0"/>
                 <w:sz w:val="22"/>
               </w:rPr>
-              <w:t>Система должна отправлять клиенту SMS-уведомления о событиях заказа: приём заявки и плановая дата готовности, необходимость согласования доп. работ, готовность автомобиля</w:t>
+              <w:t>Система должна автоматически отправлять клиенту SMS-напоминание о плановом ТО по сроку или пробегу, рассчитанному по истории обслуживания</w:t>
             </w:r>
           </w:p>
         </w:tc>
@@ -6575,7 +7079,7 @@
                 <w:i w:val="0"/>
                 <w:sz w:val="22"/>
               </w:rPr>
-              <w:t>Рис. 2: потоки сообщений клиенту (приоритет повышен с низкого)</w:t>
+              <w:t>Рис. 8: начальное событие-сообщение «Напоминание о ТО» (приоритет повышен с низкого)</w:t>
             </w:r>
           </w:p>
         </w:tc>
@@ -6604,7 +7108,7 @@
                 <w:i w:val="0"/>
                 <w:sz w:val="22"/>
               </w:rPr>
-              <w:t>F-19</w:t>
+              <w:t>F-16</w:t>
             </w:r>
           </w:p>
         </w:tc>
@@ -6628,7 +7132,7 @@
                 <w:i w:val="0"/>
                 <w:sz w:val="22"/>
               </w:rPr>
-              <w:t>нов.</w:t>
+              <w:t>изм.</w:t>
             </w:r>
           </w:p>
         </w:tc>
@@ -6652,7 +7156,7 @@
                 <w:i w:val="0"/>
                 <w:sz w:val="22"/>
               </w:rPr>
-              <w:t>Если клиент не найден по телефону или госномеру, система должна предлагать регистрацию нового клиента с подстановкой введённых при поиске данных</w:t>
+              <w:t>Система должна отправлять клиенту SMS-уведомления о событиях заказа: приём заявки и плановая дата готовности, необходимость согласования доп. работ, готовность автомобиля</w:t>
             </w:r>
           </w:p>
         </w:tc>
@@ -6676,7 +7180,7 @@
                 <w:i w:val="0"/>
                 <w:sz w:val="22"/>
               </w:rPr>
-              <w:t>Рис. 3: шлюз «Клиент найден?»</w:t>
+              <w:t>Рис. 2: потоки сообщений клиенту (приоритет повышен с низкого)</w:t>
             </w:r>
           </w:p>
         </w:tc>
@@ -6705,7 +7209,7 @@
                 <w:i w:val="0"/>
                 <w:sz w:val="22"/>
               </w:rPr>
-              <w:t>F-20</w:t>
+              <w:t>F-19</w:t>
             </w:r>
           </w:p>
         </w:tc>
@@ -6753,7 +7257,7 @@
                 <w:i w:val="0"/>
                 <w:sz w:val="22"/>
               </w:rPr>
-              <w:t>Система должна фиксировать результат согласования предварительной стоимости; при отказе заявка сохраняется со статусом «Отклонён» и указанием причины</w:t>
+              <w:t>Если клиент не найден по телефону или госномеру, система должна предлагать регистрацию нового клиента с подстановкой введённых при поиске данных</w:t>
             </w:r>
           </w:p>
         </w:tc>
@@ -6777,7 +7281,7 @@
                 <w:i w:val="0"/>
                 <w:sz w:val="22"/>
               </w:rPr>
-              <w:t>Рис. 3: шлюз «Клиент согласен?», событие «Заявка отклонена»</w:t>
+              <w:t>Рис. 3: шлюз «Клиент найден?»</w:t>
             </w:r>
           </w:p>
         </w:tc>
@@ -6806,7 +7310,7 @@
                 <w:i w:val="0"/>
                 <w:sz w:val="22"/>
               </w:rPr>
-              <w:t>F-21</w:t>
+              <w:t>F-20</w:t>
             </w:r>
           </w:p>
         </w:tc>
@@ -6854,7 +7358,7 @@
                 <w:i w:val="0"/>
                 <w:sz w:val="22"/>
               </w:rPr>
-              <w:t>Система должна формировать и печатать акт приёма автомобиля (пробег, комплектность, видимые повреждения, место для подписи клиента)</w:t>
+              <w:t>Система должна фиксировать результат согласования предварительной стоимости; при отказе заявка сохраняется со статусом «Отклонён» и указанием причины</w:t>
             </w:r>
           </w:p>
         </w:tc>
@@ -6878,7 +7382,7 @@
                 <w:i w:val="0"/>
                 <w:sz w:val="22"/>
               </w:rPr>
-              <w:t>Рис. 3: задача «Сохранить заявку…, печать акта приёма», сообщение «Акт приёма автомобиля»</w:t>
+              <w:t>Рис. 3: шлюз «Клиент согласен?», событие «Заявка отклонена»</w:t>
             </w:r>
           </w:p>
         </w:tc>
@@ -6907,7 +7411,7 @@
                 <w:i w:val="0"/>
                 <w:sz w:val="22"/>
               </w:rPr>
-              <w:t>F-22</w:t>
+              <w:t>F-21</w:t>
             </w:r>
           </w:p>
         </w:tc>
@@ -6955,7 +7459,7 @@
                 <w:i w:val="0"/>
                 <w:sz w:val="22"/>
               </w:rPr>
-              <w:t>При регистрации клиента система должна фиксировать его согласие на обработку персональных данных</w:t>
+              <w:t>Система должна формировать и печатать акт приёма автомобиля (пробег, комплектность, видимые повреждения, место для подписи клиента)</w:t>
             </w:r>
           </w:p>
         </w:tc>
@@ -6979,7 +7483,7 @@
                 <w:i w:val="0"/>
                 <w:sz w:val="22"/>
               </w:rPr>
-              <w:t>Рис. 3: задача «Зарегистрировать клиента и автомобиль»</w:t>
+              <w:t>Рис. 3: задача «Сохранить заявку…, печать акта приёма», сообщение «Акт приёма автомобиля»</w:t>
             </w:r>
           </w:p>
         </w:tc>
@@ -7008,7 +7512,7 @@
                 <w:i w:val="0"/>
                 <w:sz w:val="22"/>
               </w:rPr>
-              <w:t>F-23</w:t>
+              <w:t>F-22</w:t>
             </w:r>
           </w:p>
         </w:tc>
@@ -7056,7 +7560,7 @@
                 <w:i w:val="0"/>
                 <w:sz w:val="22"/>
               </w:rPr>
-              <w:t>Система должна предлагать ближайшее свободное время поста и механика с учётом суммарных нормо-часов работ заказа</w:t>
+              <w:t>При регистрации клиента система должна фиксировать его согласие на обработку персональных данных</w:t>
             </w:r>
           </w:p>
         </w:tc>
@@ -7080,7 +7584,7 @@
                 <w:i w:val="0"/>
                 <w:sz w:val="22"/>
               </w:rPr>
-              <w:t>Рис. 4: цикл «Выбрать пост… – Проверить пересечения»</w:t>
+              <w:t>Рис. 3: задача «Зарегистрировать клиента и автомобиль»</w:t>
             </w:r>
           </w:p>
         </w:tc>
@@ -7109,7 +7613,7 @@
                 <w:i w:val="0"/>
                 <w:sz w:val="22"/>
               </w:rPr>
-              <w:t>F-24</w:t>
+              <w:t>F-23</w:t>
             </w:r>
           </w:p>
         </w:tc>
@@ -7157,7 +7661,7 @@
                 <w:i w:val="0"/>
                 <w:sz w:val="22"/>
               </w:rPr>
-              <w:t>Система должна заполнять состав работ заказ-наряда по шаблону регламента ТО для выбранной модели автомобиля и пробега</w:t>
+              <w:t>Система должна предлагать ближайшее свободное время поста и механика с учётом суммарных нормо-часов работ заказа</w:t>
             </w:r>
           </w:p>
         </w:tc>
@@ -7181,7 +7685,7 @@
                 <w:i w:val="0"/>
                 <w:sz w:val="22"/>
               </w:rPr>
-              <w:t>Рис. 4: задача «Определить состав работ по регламенту ТО»</w:t>
+              <w:t>Рис. 4: цикл «Выбрать пост… – Проверить пересечения»</w:t>
             </w:r>
           </w:p>
         </w:tc>
@@ -7210,7 +7714,7 @@
                 <w:i w:val="0"/>
                 <w:sz w:val="22"/>
               </w:rPr>
-              <w:t>F-25</w:t>
+              <w:t>F-24</w:t>
             </w:r>
           </w:p>
         </w:tc>
@@ -7258,7 +7762,7 @@
                 <w:i w:val="0"/>
                 <w:sz w:val="22"/>
               </w:rPr>
-              <w:t>При переводе заказа в статус «Ожидает согласования» система должна уведомлять мастера-приёмщика и отображать список заказов, ожидающих согласования</w:t>
+              <w:t>Система должна заполнять состав работ заказ-наряда по шаблону регламента ТО для выбранной модели автомобиля и пробега</w:t>
             </w:r>
           </w:p>
         </w:tc>
@@ -7282,7 +7786,7 @@
                 <w:i w:val="0"/>
                 <w:sz w:val="22"/>
               </w:rPr>
-              <w:t>Рис. 5: задача «Внести доп. работы, статус «Ожидает согласования»»</w:t>
+              <w:t>Рис. 4: задача «Определить состав работ по регламенту ТО»</w:t>
             </w:r>
           </w:p>
         </w:tc>
@@ -7311,7 +7815,7 @@
                 <w:i w:val="0"/>
                 <w:sz w:val="22"/>
               </w:rPr>
-              <w:t>F-26</w:t>
+              <w:t>F-25</w:t>
             </w:r>
           </w:p>
         </w:tc>
@@ -7359,7 +7863,7 @@
                 <w:i w:val="0"/>
                 <w:sz w:val="22"/>
               </w:rPr>
-              <w:t>Система должна контролировать срок ожидания решения клиента (по умолчанию 2 часа, настраивается) и по его истечении напоминать мастеру и предлагать зафиксировать отказ</w:t>
+              <w:t>При переводе заказа в статус «Ожидает согласования» система должна уведомлять мастера-приёмщика и отображать список заказов, ожидающих согласования</w:t>
             </w:r>
           </w:p>
         </w:tc>
@@ -7383,7 +7887,7 @@
                 <w:i w:val="0"/>
                 <w:sz w:val="22"/>
               </w:rPr>
-              <w:t>Рис. 5: событийный шлюз, таймер «2 часа»</w:t>
+              <w:t>Рис. 5: задача «Внести доп. работы, статус «Ожидает согласования»»</w:t>
             </w:r>
           </w:p>
         </w:tc>
@@ -7412,7 +7916,7 @@
                 <w:i w:val="0"/>
                 <w:sz w:val="22"/>
               </w:rPr>
-              <w:t>F-27</w:t>
+              <w:t>F-26</w:t>
             </w:r>
           </w:p>
         </w:tc>
@@ -7460,7 +7964,7 @@
                 <w:i w:val="0"/>
                 <w:sz w:val="22"/>
               </w:rPr>
-              <w:t>Система должна фиксировать время начала и окончания работ по заказ-наряду для учёта фактической выработки механиков</w:t>
+              <w:t>Система должна контролировать срок ожидания решения клиента (по умолчанию 2 часа, настраивается) и по его истечении напоминать мастеру и предлагать зафиксировать отказ</w:t>
             </w:r>
           </w:p>
         </w:tc>
@@ -7484,7 +7988,7 @@
                 <w:i w:val="0"/>
                 <w:sz w:val="22"/>
               </w:rPr>
-              <w:t>Рис. 5: задача «Статус «Выполнен», учесть выработку»</w:t>
+              <w:t>Рис. 5: событийный шлюз, таймер «2 часа»</w:t>
             </w:r>
           </w:p>
         </w:tc>
@@ -7513,7 +8017,7 @@
                 <w:i w:val="0"/>
                 <w:sz w:val="22"/>
               </w:rPr>
-              <w:t>F-28</w:t>
+              <w:t>F-27</w:t>
             </w:r>
           </w:p>
         </w:tc>
@@ -7561,7 +8065,7 @@
                 <w:i w:val="0"/>
                 <w:sz w:val="22"/>
               </w:rPr>
-              <w:t>Перед расчётом итоговой стоимости система должна проверять полноту заказа (все работы выполнены, по доп. работам есть решение клиента, указаны запчасти) и при нарушениях запрещать формирование квитанции, показывая список расхождений</w:t>
+              <w:t>Система должна фиксировать время начала и окончания работ по заказ-наряду для учёта фактической выработки механиков</w:t>
             </w:r>
           </w:p>
         </w:tc>
@@ -7585,7 +8089,7 @@
                 <w:i w:val="0"/>
                 <w:sz w:val="22"/>
               </w:rPr>
-              <w:t>Рис. 6: задача «Проверить полноту заказа», шлюз «Заказ полный?»</w:t>
+              <w:t>Рис. 5: задача «Статус «Выполнен», учесть выработку»</w:t>
             </w:r>
           </w:p>
         </w:tc>
@@ -7614,7 +8118,7 @@
                 <w:i w:val="0"/>
                 <w:sz w:val="22"/>
               </w:rPr>
-              <w:t>F-29</w:t>
+              <w:t>F-28</w:t>
             </w:r>
           </w:p>
         </w:tc>
@@ -7662,7 +8166,7 @@
                 <w:i w:val="0"/>
                 <w:sz w:val="22"/>
               </w:rPr>
-              <w:t>Система должна передавать данные о расчёте в ККТ для печати кассового чека; закрытие заказа возможно только после фиксации оплаты</w:t>
+              <w:t>Перед расчётом итоговой стоимости система должна проверять полноту заказа (все работы выполнены, по доп. работам есть решение клиента, указаны запчасти) и при нарушениях запрещать формирование квитанции, показывая список расхождений</w:t>
             </w:r>
           </w:p>
         </w:tc>
@@ -7686,7 +8190,7 @@
                 <w:i w:val="0"/>
                 <w:sz w:val="22"/>
               </w:rPr>
-              <w:t>Рис. 6: задача «Зафиксировать оплату, пробить чек (ККТ)», параллельный шлюз</w:t>
+              <w:t>Рис. 6: задача «Проверить полноту заказа», шлюз «Заказ полный?»</w:t>
             </w:r>
           </w:p>
         </w:tc>
@@ -7715,6 +8219,107 @@
                 <w:i w:val="0"/>
                 <w:sz w:val="22"/>
               </w:rPr>
+              <w:t>F-29</w:t>
+            </w:r>
+          </w:p>
+        </w:tc>
+        <w:tc>
+          <w:tcPr>
+            <w:tcW w:type="dxa" w:w="680"/>
+            <w:vAlign w:val="top"/>
+          </w:tcPr>
+          <w:p>
+            <w:pPr>
+              <w:keepNext w:val="0"/>
+              <w:spacing w:line="240" w:lineRule="auto" w:before="0" w:after="0"/>
+              <w:ind w:firstLine="0"/>
+              <w:jc w:val="center"/>
+            </w:pPr>
+            <w:r/>
+            <w:r>
+              <w:rPr>
+                <w:rFonts w:ascii="Times New Roman" w:hAnsi="Times New Roman" w:cs="Times New Roman" w:eastAsia="Times New Roman"/>
+                <w:b w:val="0"/>
+                <w:i w:val="0"/>
+                <w:sz w:val="22"/>
+              </w:rPr>
+              <w:t>нов.</w:t>
+            </w:r>
+          </w:p>
+        </w:tc>
+        <w:tc>
+          <w:tcPr>
+            <w:tcW w:type="dxa" w:w="4762"/>
+            <w:vAlign w:val="top"/>
+          </w:tcPr>
+          <w:p>
+            <w:pPr>
+              <w:keepNext w:val="0"/>
+              <w:spacing w:line="240" w:lineRule="auto" w:before="0" w:after="0"/>
+              <w:ind w:firstLine="0"/>
+              <w:jc w:val="left"/>
+            </w:pPr>
+            <w:r/>
+            <w:r>
+              <w:rPr>
+                <w:rFonts w:ascii="Times New Roman" w:hAnsi="Times New Roman" w:cs="Times New Roman" w:eastAsia="Times New Roman"/>
+                <w:b w:val="0"/>
+                <w:i w:val="0"/>
+                <w:sz w:val="22"/>
+              </w:rPr>
+              <w:t>Система должна передавать данные о расчёте в ККТ для печати кассового чека; закрытие заказа возможно только после фиксации оплаты</w:t>
+            </w:r>
+          </w:p>
+        </w:tc>
+        <w:tc>
+          <w:tcPr>
+            <w:tcW w:type="dxa" w:w="3175"/>
+            <w:vAlign w:val="top"/>
+          </w:tcPr>
+          <w:p>
+            <w:pPr>
+              <w:keepNext w:val="0"/>
+              <w:spacing w:line="240" w:lineRule="auto" w:before="0" w:after="0"/>
+              <w:ind w:firstLine="0"/>
+              <w:jc w:val="left"/>
+            </w:pPr>
+            <w:r/>
+            <w:r>
+              <w:rPr>
+                <w:rFonts w:ascii="Times New Roman" w:hAnsi="Times New Roman" w:cs="Times New Roman" w:eastAsia="Times New Roman"/>
+                <w:b w:val="0"/>
+                <w:i w:val="0"/>
+                <w:sz w:val="22"/>
+              </w:rPr>
+              <w:t>Рис. 6: задача «Зафиксировать оплату, пробить чек (ККТ)», параллельный шлюз</w:t>
+            </w:r>
+          </w:p>
+        </w:tc>
+      </w:tr>
+      <w:tr>
+        <w:trPr>
+          <w:cantSplit/>
+        </w:trPr>
+        <w:tc>
+          <w:tcPr>
+            <w:tcW w:type="dxa" w:w="737"/>
+            <w:vAlign w:val="top"/>
+          </w:tcPr>
+          <w:p>
+            <w:pPr>
+              <w:keepNext w:val="0"/>
+              <w:spacing w:line="240" w:lineRule="auto" w:before="0" w:after="0"/>
+              <w:ind w:firstLine="0"/>
+              <w:jc w:val="center"/>
+            </w:pPr>
+            <w:r/>
+            <w:r>
+              <w:rPr>
+                <w:rFonts w:ascii="Times New Roman" w:hAnsi="Times New Roman" w:cs="Times New Roman" w:eastAsia="Times New Roman"/>
+                <w:b w:val="0"/>
+                <w:i w:val="0"/>
+                <w:sz w:val="22"/>
+              </w:rPr>
               <w:t>F-30</w:t>
             </w:r>
           </w:p>
@@ -7788,6 +8393,410 @@
                 <w:sz w:val="22"/>
               </w:rPr>
               <w:t>Рис. 7: таймерное начальное событие «Ежедневно в 21:00»</w:t>
+            </w:r>
+          </w:p>
+        </w:tc>
+      </w:tr>
+      <w:tr>
+        <w:trPr>
+          <w:cantSplit/>
+        </w:trPr>
+        <w:tc>
+          <w:tcPr>
+            <w:tcW w:type="dxa" w:w="737"/>
+            <w:vAlign w:val="top"/>
+          </w:tcPr>
+          <w:p>
+            <w:pPr>
+              <w:keepNext w:val="0"/>
+              <w:spacing w:line="240" w:lineRule="auto" w:before="0" w:after="0"/>
+              <w:ind w:firstLine="0"/>
+              <w:jc w:val="center"/>
+            </w:pPr>
+            <w:r/>
+            <w:r>
+              <w:rPr>
+                <w:rFonts w:ascii="Times New Roman" w:hAnsi="Times New Roman" w:cs="Times New Roman" w:eastAsia="Times New Roman"/>
+                <w:b w:val="0"/>
+                <w:i w:val="0"/>
+                <w:sz w:val="22"/>
+              </w:rPr>
+              <w:t>F-31</w:t>
+            </w:r>
+          </w:p>
+        </w:tc>
+        <w:tc>
+          <w:tcPr>
+            <w:tcW w:type="dxa" w:w="680"/>
+            <w:vAlign w:val="top"/>
+          </w:tcPr>
+          <w:p>
+            <w:pPr>
+              <w:keepNext w:val="0"/>
+              <w:spacing w:line="240" w:lineRule="auto" w:before="0" w:after="0"/>
+              <w:ind w:firstLine="0"/>
+              <w:jc w:val="center"/>
+            </w:pPr>
+            <w:r/>
+            <w:r>
+              <w:rPr>
+                <w:rFonts w:ascii="Times New Roman" w:hAnsi="Times New Roman" w:cs="Times New Roman" w:eastAsia="Times New Roman"/>
+                <w:b w:val="0"/>
+                <w:i w:val="0"/>
+                <w:sz w:val="22"/>
+              </w:rPr>
+              <w:t>нов.</w:t>
+            </w:r>
+          </w:p>
+        </w:tc>
+        <w:tc>
+          <w:tcPr>
+            <w:tcW w:type="dxa" w:w="4762"/>
+            <w:vAlign w:val="top"/>
+          </w:tcPr>
+          <w:p>
+            <w:pPr>
+              <w:keepNext w:val="0"/>
+              <w:spacing w:line="240" w:lineRule="auto" w:before="0" w:after="0"/>
+              <w:ind w:firstLine="0"/>
+              <w:jc w:val="left"/>
+            </w:pPr>
+            <w:r/>
+            <w:r>
+              <w:rPr>
+                <w:rFonts w:ascii="Times New Roman" w:hAnsi="Times New Roman" w:cs="Times New Roman" w:eastAsia="Times New Roman"/>
+                <w:b w:val="0"/>
+                <w:i w:val="0"/>
+                <w:sz w:val="22"/>
+              </w:rPr>
+              <w:t>Система должна обеспечивать онлайн-запись клиента на обслуживание: выбор услуги, даты и свободного времени, отправку SMS-подтверждения записи</w:t>
+            </w:r>
+          </w:p>
+        </w:tc>
+        <w:tc>
+          <w:tcPr>
+            <w:tcW w:type="dxa" w:w="3175"/>
+            <w:vAlign w:val="top"/>
+          </w:tcPr>
+          <w:p>
+            <w:pPr>
+              <w:keepNext w:val="0"/>
+              <w:spacing w:line="240" w:lineRule="auto" w:before="0" w:after="0"/>
+              <w:ind w:firstLine="0"/>
+              <w:jc w:val="left"/>
+            </w:pPr>
+            <w:r/>
+            <w:r>
+              <w:rPr>
+                <w:rFonts w:ascii="Times New Roman" w:hAnsi="Times New Roman" w:cs="Times New Roman" w:eastAsia="Times New Roman"/>
+                <w:b w:val="0"/>
+                <w:i w:val="0"/>
+                <w:sz w:val="22"/>
+              </w:rPr>
+              <w:t>Рис. 8: задача «Записаться онлайн», событие «Запись подтверждена»</w:t>
+            </w:r>
+          </w:p>
+        </w:tc>
+      </w:tr>
+      <w:tr>
+        <w:trPr>
+          <w:cantSplit/>
+        </w:trPr>
+        <w:tc>
+          <w:tcPr>
+            <w:tcW w:type="dxa" w:w="737"/>
+            <w:vAlign w:val="top"/>
+          </w:tcPr>
+          <w:p>
+            <w:pPr>
+              <w:keepNext w:val="0"/>
+              <w:spacing w:line="240" w:lineRule="auto" w:before="0" w:after="0"/>
+              <w:ind w:firstLine="0"/>
+              <w:jc w:val="center"/>
+            </w:pPr>
+            <w:r/>
+            <w:r>
+              <w:rPr>
+                <w:rFonts w:ascii="Times New Roman" w:hAnsi="Times New Roman" w:cs="Times New Roman" w:eastAsia="Times New Roman"/>
+                <w:b w:val="0"/>
+                <w:i w:val="0"/>
+                <w:sz w:val="22"/>
+              </w:rPr>
+              <w:t>F-32</w:t>
+            </w:r>
+          </w:p>
+        </w:tc>
+        <w:tc>
+          <w:tcPr>
+            <w:tcW w:type="dxa" w:w="680"/>
+            <w:vAlign w:val="top"/>
+          </w:tcPr>
+          <w:p>
+            <w:pPr>
+              <w:keepNext w:val="0"/>
+              <w:spacing w:line="240" w:lineRule="auto" w:before="0" w:after="0"/>
+              <w:ind w:firstLine="0"/>
+              <w:jc w:val="center"/>
+            </w:pPr>
+            <w:r/>
+            <w:r>
+              <w:rPr>
+                <w:rFonts w:ascii="Times New Roman" w:hAnsi="Times New Roman" w:cs="Times New Roman" w:eastAsia="Times New Roman"/>
+                <w:b w:val="0"/>
+                <w:i w:val="0"/>
+                <w:sz w:val="22"/>
+              </w:rPr>
+              <w:t>нов.</w:t>
+            </w:r>
+          </w:p>
+        </w:tc>
+        <w:tc>
+          <w:tcPr>
+            <w:tcW w:type="dxa" w:w="4762"/>
+            <w:vAlign w:val="top"/>
+          </w:tcPr>
+          <w:p>
+            <w:pPr>
+              <w:keepNext w:val="0"/>
+              <w:spacing w:line="240" w:lineRule="auto" w:before="0" w:after="0"/>
+              <w:ind w:firstLine="0"/>
+              <w:jc w:val="left"/>
+            </w:pPr>
+            <w:r/>
+            <w:r>
+              <w:rPr>
+                <w:rFonts w:ascii="Times New Roman" w:hAnsi="Times New Roman" w:cs="Times New Roman" w:eastAsia="Times New Roman"/>
+                <w:b w:val="0"/>
+                <w:i w:val="0"/>
+                <w:sz w:val="22"/>
+              </w:rPr>
+              <w:t>Система должна отправлять клиенту SMS-напоминание о визите за сутки до записи</w:t>
+            </w:r>
+          </w:p>
+        </w:tc>
+        <w:tc>
+          <w:tcPr>
+            <w:tcW w:type="dxa" w:w="3175"/>
+            <w:vAlign w:val="top"/>
+          </w:tcPr>
+          <w:p>
+            <w:pPr>
+              <w:keepNext w:val="0"/>
+              <w:spacing w:line="240" w:lineRule="auto" w:before="0" w:after="0"/>
+              <w:ind w:firstLine="0"/>
+              <w:jc w:val="left"/>
+            </w:pPr>
+            <w:r/>
+            <w:r>
+              <w:rPr>
+                <w:rFonts w:ascii="Times New Roman" w:hAnsi="Times New Roman" w:cs="Times New Roman" w:eastAsia="Times New Roman"/>
+                <w:b w:val="0"/>
+                <w:i w:val="0"/>
+                <w:sz w:val="22"/>
+              </w:rPr>
+              <w:t>Рис. 8: таймерное событие «День визита»</w:t>
+            </w:r>
+          </w:p>
+        </w:tc>
+      </w:tr>
+      <w:tr>
+        <w:trPr>
+          <w:cantSplit/>
+        </w:trPr>
+        <w:tc>
+          <w:tcPr>
+            <w:tcW w:type="dxa" w:w="737"/>
+            <w:vAlign w:val="top"/>
+          </w:tcPr>
+          <w:p>
+            <w:pPr>
+              <w:keepNext w:val="0"/>
+              <w:spacing w:line="240" w:lineRule="auto" w:before="0" w:after="0"/>
+              <w:ind w:firstLine="0"/>
+              <w:jc w:val="center"/>
+            </w:pPr>
+            <w:r/>
+            <w:r>
+              <w:rPr>
+                <w:rFonts w:ascii="Times New Roman" w:hAnsi="Times New Roman" w:cs="Times New Roman" w:eastAsia="Times New Roman"/>
+                <w:b w:val="0"/>
+                <w:i w:val="0"/>
+                <w:sz w:val="22"/>
+              </w:rPr>
+              <w:t>F-33</w:t>
+            </w:r>
+          </w:p>
+        </w:tc>
+        <w:tc>
+          <w:tcPr>
+            <w:tcW w:type="dxa" w:w="680"/>
+            <w:vAlign w:val="top"/>
+          </w:tcPr>
+          <w:p>
+            <w:pPr>
+              <w:keepNext w:val="0"/>
+              <w:spacing w:line="240" w:lineRule="auto" w:before="0" w:after="0"/>
+              <w:ind w:firstLine="0"/>
+              <w:jc w:val="center"/>
+            </w:pPr>
+            <w:r/>
+            <w:r>
+              <w:rPr>
+                <w:rFonts w:ascii="Times New Roman" w:hAnsi="Times New Roman" w:cs="Times New Roman" w:eastAsia="Times New Roman"/>
+                <w:b w:val="0"/>
+                <w:i w:val="0"/>
+                <w:sz w:val="22"/>
+              </w:rPr>
+              <w:t>нов.</w:t>
+            </w:r>
+          </w:p>
+        </w:tc>
+        <w:tc>
+          <w:tcPr>
+            <w:tcW w:type="dxa" w:w="4762"/>
+            <w:vAlign w:val="top"/>
+          </w:tcPr>
+          <w:p>
+            <w:pPr>
+              <w:keepNext w:val="0"/>
+              <w:spacing w:line="240" w:lineRule="auto" w:before="0" w:after="0"/>
+              <w:ind w:firstLine="0"/>
+              <w:jc w:val="left"/>
+            </w:pPr>
+            <w:r/>
+            <w:r>
+              <w:rPr>
+                <w:rFonts w:ascii="Times New Roman" w:hAnsi="Times New Roman" w:cs="Times New Roman" w:eastAsia="Times New Roman"/>
+                <w:b w:val="0"/>
+                <w:i w:val="0"/>
+                <w:sz w:val="22"/>
+              </w:rPr>
+              <w:t>Система должна позволять клиенту согласовать или отклонить доп. работы по ссылке из SMS; ответ автоматически фиксируется в заказе</w:t>
+            </w:r>
+          </w:p>
+        </w:tc>
+        <w:tc>
+          <w:tcPr>
+            <w:tcW w:type="dxa" w:w="3175"/>
+            <w:vAlign w:val="top"/>
+          </w:tcPr>
+          <w:p>
+            <w:pPr>
+              <w:keepNext w:val="0"/>
+              <w:spacing w:line="240" w:lineRule="auto" w:before="0" w:after="0"/>
+              <w:ind w:firstLine="0"/>
+              <w:jc w:val="left"/>
+            </w:pPr>
+            <w:r/>
+            <w:r>
+              <w:rPr>
+                <w:rFonts w:ascii="Times New Roman" w:hAnsi="Times New Roman" w:cs="Times New Roman" w:eastAsia="Times New Roman"/>
+                <w:b w:val="0"/>
+                <w:i w:val="0"/>
+                <w:sz w:val="22"/>
+              </w:rPr>
+              <w:t>Рис. 9: задача «Принять решение, сообщить мастеру»</w:t>
+            </w:r>
+          </w:p>
+        </w:tc>
+      </w:tr>
+      <w:tr>
+        <w:trPr>
+          <w:cantSplit/>
+        </w:trPr>
+        <w:tc>
+          <w:tcPr>
+            <w:tcW w:type="dxa" w:w="737"/>
+            <w:vAlign w:val="top"/>
+          </w:tcPr>
+          <w:p>
+            <w:pPr>
+              <w:keepNext w:val="0"/>
+              <w:spacing w:line="240" w:lineRule="auto" w:before="0" w:after="0"/>
+              <w:ind w:firstLine="0"/>
+              <w:jc w:val="center"/>
+            </w:pPr>
+            <w:r/>
+            <w:r>
+              <w:rPr>
+                <w:rFonts w:ascii="Times New Roman" w:hAnsi="Times New Roman" w:cs="Times New Roman" w:eastAsia="Times New Roman"/>
+                <w:b w:val="0"/>
+                <w:i w:val="0"/>
+                <w:sz w:val="22"/>
+              </w:rPr>
+              <w:t>F-34</w:t>
+            </w:r>
+          </w:p>
+        </w:tc>
+        <w:tc>
+          <w:tcPr>
+            <w:tcW w:type="dxa" w:w="680"/>
+            <w:vAlign w:val="top"/>
+          </w:tcPr>
+          <w:p>
+            <w:pPr>
+              <w:keepNext w:val="0"/>
+              <w:spacing w:line="240" w:lineRule="auto" w:before="0" w:after="0"/>
+              <w:ind w:firstLine="0"/>
+              <w:jc w:val="center"/>
+            </w:pPr>
+            <w:r/>
+            <w:r>
+              <w:rPr>
+                <w:rFonts w:ascii="Times New Roman" w:hAnsi="Times New Roman" w:cs="Times New Roman" w:eastAsia="Times New Roman"/>
+                <w:b w:val="0"/>
+                <w:i w:val="0"/>
+                <w:sz w:val="22"/>
+              </w:rPr>
+              <w:t>нов.</w:t>
+            </w:r>
+          </w:p>
+        </w:tc>
+        <w:tc>
+          <w:tcPr>
+            <w:tcW w:type="dxa" w:w="4762"/>
+            <w:vAlign w:val="top"/>
+          </w:tcPr>
+          <w:p>
+            <w:pPr>
+              <w:keepNext w:val="0"/>
+              <w:spacing w:line="240" w:lineRule="auto" w:before="0" w:after="0"/>
+              <w:ind w:firstLine="0"/>
+              <w:jc w:val="left"/>
+            </w:pPr>
+            <w:r/>
+            <w:r>
+              <w:rPr>
+                <w:rFonts w:ascii="Times New Roman" w:hAnsi="Times New Roman" w:cs="Times New Roman" w:eastAsia="Times New Roman"/>
+                <w:b w:val="0"/>
+                <w:i w:val="0"/>
+                <w:sz w:val="22"/>
+              </w:rPr>
+              <w:t>Система должна отправлять клиенту электронную копию квитанции и кассового чека (ссылка в SMS или по e-mail)</w:t>
+            </w:r>
+          </w:p>
+        </w:tc>
+        <w:tc>
+          <w:tcPr>
+            <w:tcW w:type="dxa" w:w="3175"/>
+            <w:vAlign w:val="top"/>
+          </w:tcPr>
+          <w:p>
+            <w:pPr>
+              <w:keepNext w:val="0"/>
+              <w:spacing w:line="240" w:lineRule="auto" w:before="0" w:after="0"/>
+              <w:ind w:firstLine="0"/>
+              <w:jc w:val="left"/>
+            </w:pPr>
+            <w:r/>
+            <w:r>
+              <w:rPr>
+                <w:rFonts w:ascii="Times New Roman" w:hAnsi="Times New Roman" w:cs="Times New Roman" w:eastAsia="Times New Roman"/>
+                <w:b w:val="0"/>
+                <w:i w:val="0"/>
+                <w:sz w:val="22"/>
+              </w:rPr>
+              <w:t>Рис. 9: поток сообщений «Электронная квитанция»</w:t>
             </w:r>
           </w:p>
         </w:tc>
@@ -10336,6 +11345,23 @@
               <w:t>F-15</w:t>
             </w:r>
           </w:p>
+          <w:p>
+            <w:pPr>
+              <w:keepNext w:val="0"/>
+              <w:spacing w:line="240" w:lineRule="auto" w:before="0" w:after="0"/>
+              <w:ind w:firstLine="0"/>
+              <w:jc w:val="center"/>
+            </w:pPr>
+            <w:r>
+              <w:rPr>
+                <w:rFonts w:ascii="Times New Roman" w:hAnsi="Times New Roman" w:cs="Times New Roman" w:eastAsia="Times New Roman"/>
+                <w:b w:val="0"/>
+                <w:i w:val="0"/>
+                <w:sz w:val="22"/>
+              </w:rPr>
+              <w:t>(изм.)</w:t>
+            </w:r>
+          </w:p>
         </w:tc>
         <w:tc>
           <w:tcPr>
@@ -10353,11 +11379,11 @@
             <w:r>
               <w:rPr>
                 <w:rFonts w:ascii="Times New Roman" w:hAnsi="Times New Roman" w:cs="Times New Roman" w:eastAsia="Times New Roman"/>
-                <w:b w:val="0"/>
-                <w:i w:val="0"/>
-                <w:sz w:val="22"/>
-              </w:rPr>
-              <w:t>Система должна формировать список клиентов, у которых наступает срок планового ТО</w:t>
+                <w:b/>
+                <w:i w:val="0"/>
+                <w:sz w:val="22"/>
+              </w:rPr>
+              <w:t>Система должна автоматически отправлять клиенту SMS-напоминание о плановом ТО по сроку или пробегу, рассчитанному по истории обслуживания</w:t>
             </w:r>
           </w:p>
         </w:tc>
@@ -10381,7 +11407,7 @@
                 <w:i w:val="0"/>
                 <w:sz w:val="22"/>
               </w:rPr>
-              <w:t>Низкий</w:t>
+              <w:t>Средний</w:t>
             </w:r>
           </w:p>
         </w:tc>
@@ -12478,6 +13504,574 @@
                 <w:sz w:val="22"/>
               </w:rPr>
               <w:t>Средний</w:t>
+            </w:r>
+          </w:p>
+        </w:tc>
+        <w:tc>
+          <w:tcPr>
+            <w:tcW w:type="dxa" w:w="1871"/>
+            <w:vAlign w:val="top"/>
+          </w:tcPr>
+          <w:p>
+            <w:pPr>
+              <w:keepNext w:val="0"/>
+              <w:spacing w:line="240" w:lineRule="auto" w:before="0" w:after="0"/>
+              <w:ind w:firstLine="0"/>
+              <w:jc w:val="center"/>
+            </w:pPr>
+            <w:r/>
+            <w:r>
+              <w:rPr>
+                <w:rFonts w:ascii="Times New Roman" w:hAnsi="Times New Roman" w:cs="Times New Roman" w:eastAsia="Times New Roman"/>
+                <w:b w:val="0"/>
+                <w:i w:val="0"/>
+                <w:sz w:val="22"/>
+              </w:rPr>
+              <w:t>Высокая</w:t>
+            </w:r>
+          </w:p>
+        </w:tc>
+        <w:tc>
+          <w:tcPr>
+            <w:tcW w:type="dxa" w:w="1984"/>
+            <w:vAlign w:val="top"/>
+          </w:tcPr>
+          <w:p>
+            <w:pPr>
+              <w:keepNext w:val="0"/>
+              <w:spacing w:line="240" w:lineRule="auto" w:before="0" w:after="0"/>
+              <w:ind w:firstLine="0"/>
+              <w:jc w:val="center"/>
+            </w:pPr>
+            <w:r/>
+            <w:r>
+              <w:rPr>
+                <w:rFonts w:ascii="Times New Roman" w:hAnsi="Times New Roman" w:cs="Times New Roman" w:eastAsia="Times New Roman"/>
+                <w:b w:val="0"/>
+                <w:i w:val="0"/>
+                <w:sz w:val="22"/>
+              </w:rPr>
+              <w:t>Средняя</w:t>
+            </w:r>
+          </w:p>
+        </w:tc>
+      </w:tr>
+      <w:tr>
+        <w:trPr>
+          <w:cantSplit/>
+        </w:trPr>
+        <w:tc>
+          <w:tcPr>
+            <w:tcW w:type="dxa" w:w="964"/>
+            <w:vAlign w:val="top"/>
+          </w:tcPr>
+          <w:p>
+            <w:pPr>
+              <w:keepNext w:val="0"/>
+              <w:spacing w:line="240" w:lineRule="auto" w:before="0" w:after="0"/>
+              <w:ind w:firstLine="0"/>
+              <w:jc w:val="center"/>
+            </w:pPr>
+            <w:r/>
+            <w:r>
+              <w:rPr>
+                <w:rFonts w:ascii="Times New Roman" w:hAnsi="Times New Roman" w:cs="Times New Roman" w:eastAsia="Times New Roman"/>
+                <w:b w:val="0"/>
+                <w:i w:val="0"/>
+                <w:sz w:val="22"/>
+              </w:rPr>
+              <w:t>F-31</w:t>
+            </w:r>
+          </w:p>
+          <w:p>
+            <w:pPr>
+              <w:keepNext w:val="0"/>
+              <w:spacing w:line="240" w:lineRule="auto" w:before="0" w:after="0"/>
+              <w:ind w:firstLine="0"/>
+              <w:jc w:val="center"/>
+            </w:pPr>
+            <w:r>
+              <w:rPr>
+                <w:rFonts w:ascii="Times New Roman" w:hAnsi="Times New Roman" w:cs="Times New Roman" w:eastAsia="Times New Roman"/>
+                <w:b w:val="0"/>
+                <w:i w:val="0"/>
+                <w:sz w:val="22"/>
+              </w:rPr>
+              <w:t>(нов.)</w:t>
+            </w:r>
+          </w:p>
+        </w:tc>
+        <w:tc>
+          <w:tcPr>
+            <w:tcW w:type="dxa" w:w="3118"/>
+            <w:vAlign w:val="top"/>
+          </w:tcPr>
+          <w:p>
+            <w:pPr>
+              <w:keepNext w:val="0"/>
+              <w:spacing w:line="240" w:lineRule="auto" w:before="0" w:after="0"/>
+              <w:ind w:firstLine="0"/>
+              <w:jc w:val="left"/>
+            </w:pPr>
+            <w:r/>
+            <w:r>
+              <w:rPr>
+                <w:rFonts w:ascii="Times New Roman" w:hAnsi="Times New Roman" w:cs="Times New Roman" w:eastAsia="Times New Roman"/>
+                <w:b/>
+                <w:i w:val="0"/>
+                <w:sz w:val="22"/>
+              </w:rPr>
+              <w:t>Система должна обеспечивать онлайн-запись клиента на обслуживание: выбор услуги, даты и свободного времени, отправку SMS-подтверждения записи</w:t>
+            </w:r>
+          </w:p>
+        </w:tc>
+        <w:tc>
+          <w:tcPr>
+            <w:tcW w:type="dxa" w:w="1417"/>
+            <w:vAlign w:val="top"/>
+          </w:tcPr>
+          <w:p>
+            <w:pPr>
+              <w:keepNext w:val="0"/>
+              <w:spacing w:line="240" w:lineRule="auto" w:before="0" w:after="0"/>
+              <w:ind w:firstLine="0"/>
+              <w:jc w:val="center"/>
+            </w:pPr>
+            <w:r/>
+            <w:r>
+              <w:rPr>
+                <w:rFonts w:ascii="Times New Roman" w:hAnsi="Times New Roman" w:cs="Times New Roman" w:eastAsia="Times New Roman"/>
+                <w:b w:val="0"/>
+                <w:i w:val="0"/>
+                <w:sz w:val="22"/>
+              </w:rPr>
+              <w:t>Средний</w:t>
+            </w:r>
+          </w:p>
+        </w:tc>
+        <w:tc>
+          <w:tcPr>
+            <w:tcW w:type="dxa" w:w="1871"/>
+            <w:vAlign w:val="top"/>
+          </w:tcPr>
+          <w:p>
+            <w:pPr>
+              <w:keepNext w:val="0"/>
+              <w:spacing w:line="240" w:lineRule="auto" w:before="0" w:after="0"/>
+              <w:ind w:firstLine="0"/>
+              <w:jc w:val="center"/>
+            </w:pPr>
+            <w:r/>
+            <w:r>
+              <w:rPr>
+                <w:rFonts w:ascii="Times New Roman" w:hAnsi="Times New Roman" w:cs="Times New Roman" w:eastAsia="Times New Roman"/>
+                <w:b w:val="0"/>
+                <w:i w:val="0"/>
+                <w:sz w:val="22"/>
+              </w:rPr>
+              <w:t>Высокая</w:t>
+            </w:r>
+          </w:p>
+        </w:tc>
+        <w:tc>
+          <w:tcPr>
+            <w:tcW w:type="dxa" w:w="1984"/>
+            <w:vAlign w:val="top"/>
+          </w:tcPr>
+          <w:p>
+            <w:pPr>
+              <w:keepNext w:val="0"/>
+              <w:spacing w:line="240" w:lineRule="auto" w:before="0" w:after="0"/>
+              <w:ind w:firstLine="0"/>
+              <w:jc w:val="center"/>
+            </w:pPr>
+            <w:r/>
+            <w:r>
+              <w:rPr>
+                <w:rFonts w:ascii="Times New Roman" w:hAnsi="Times New Roman" w:cs="Times New Roman" w:eastAsia="Times New Roman"/>
+                <w:b w:val="0"/>
+                <w:i w:val="0"/>
+                <w:sz w:val="22"/>
+              </w:rPr>
+              <w:t>Высокая</w:t>
+            </w:r>
+          </w:p>
+        </w:tc>
+      </w:tr>
+      <w:tr>
+        <w:trPr>
+          <w:cantSplit/>
+        </w:trPr>
+        <w:tc>
+          <w:tcPr>
+            <w:tcW w:type="dxa" w:w="964"/>
+            <w:vAlign w:val="top"/>
+          </w:tcPr>
+          <w:p>
+            <w:pPr>
+              <w:keepNext w:val="0"/>
+              <w:spacing w:line="240" w:lineRule="auto" w:before="0" w:after="0"/>
+              <w:ind w:firstLine="0"/>
+              <w:jc w:val="center"/>
+            </w:pPr>
+            <w:r/>
+            <w:r>
+              <w:rPr>
+                <w:rFonts w:ascii="Times New Roman" w:hAnsi="Times New Roman" w:cs="Times New Roman" w:eastAsia="Times New Roman"/>
+                <w:b w:val="0"/>
+                <w:i w:val="0"/>
+                <w:sz w:val="22"/>
+              </w:rPr>
+              <w:t>F-32</w:t>
+            </w:r>
+          </w:p>
+          <w:p>
+            <w:pPr>
+              <w:keepNext w:val="0"/>
+              <w:spacing w:line="240" w:lineRule="auto" w:before="0" w:after="0"/>
+              <w:ind w:firstLine="0"/>
+              <w:jc w:val="center"/>
+            </w:pPr>
+            <w:r>
+              <w:rPr>
+                <w:rFonts w:ascii="Times New Roman" w:hAnsi="Times New Roman" w:cs="Times New Roman" w:eastAsia="Times New Roman"/>
+                <w:b w:val="0"/>
+                <w:i w:val="0"/>
+                <w:sz w:val="22"/>
+              </w:rPr>
+              <w:t>(нов.)</w:t>
+            </w:r>
+          </w:p>
+        </w:tc>
+        <w:tc>
+          <w:tcPr>
+            <w:tcW w:type="dxa" w:w="3118"/>
+            <w:vAlign w:val="top"/>
+          </w:tcPr>
+          <w:p>
+            <w:pPr>
+              <w:keepNext w:val="0"/>
+              <w:spacing w:line="240" w:lineRule="auto" w:before="0" w:after="0"/>
+              <w:ind w:firstLine="0"/>
+              <w:jc w:val="left"/>
+            </w:pPr>
+            <w:r/>
+            <w:r>
+              <w:rPr>
+                <w:rFonts w:ascii="Times New Roman" w:hAnsi="Times New Roman" w:cs="Times New Roman" w:eastAsia="Times New Roman"/>
+                <w:b/>
+                <w:i w:val="0"/>
+                <w:sz w:val="22"/>
+              </w:rPr>
+              <w:t>Система должна отправлять клиенту SMS-напоминание о визите за сутки до записи</w:t>
+            </w:r>
+          </w:p>
+        </w:tc>
+        <w:tc>
+          <w:tcPr>
+            <w:tcW w:type="dxa" w:w="1417"/>
+            <w:vAlign w:val="top"/>
+          </w:tcPr>
+          <w:p>
+            <w:pPr>
+              <w:keepNext w:val="0"/>
+              <w:spacing w:line="240" w:lineRule="auto" w:before="0" w:after="0"/>
+              <w:ind w:firstLine="0"/>
+              <w:jc w:val="center"/>
+            </w:pPr>
+            <w:r/>
+            <w:r>
+              <w:rPr>
+                <w:rFonts w:ascii="Times New Roman" w:hAnsi="Times New Roman" w:cs="Times New Roman" w:eastAsia="Times New Roman"/>
+                <w:b w:val="0"/>
+                <w:i w:val="0"/>
+                <w:sz w:val="22"/>
+              </w:rPr>
+              <w:t>Низкий</w:t>
+            </w:r>
+          </w:p>
+        </w:tc>
+        <w:tc>
+          <w:tcPr>
+            <w:tcW w:type="dxa" w:w="1871"/>
+            <w:vAlign w:val="top"/>
+          </w:tcPr>
+          <w:p>
+            <w:pPr>
+              <w:keepNext w:val="0"/>
+              <w:spacing w:line="240" w:lineRule="auto" w:before="0" w:after="0"/>
+              <w:ind w:firstLine="0"/>
+              <w:jc w:val="center"/>
+            </w:pPr>
+            <w:r/>
+            <w:r>
+              <w:rPr>
+                <w:rFonts w:ascii="Times New Roman" w:hAnsi="Times New Roman" w:cs="Times New Roman" w:eastAsia="Times New Roman"/>
+                <w:b w:val="0"/>
+                <w:i w:val="0"/>
+                <w:sz w:val="22"/>
+              </w:rPr>
+              <w:t>Высокая</w:t>
+            </w:r>
+          </w:p>
+        </w:tc>
+        <w:tc>
+          <w:tcPr>
+            <w:tcW w:type="dxa" w:w="1984"/>
+            <w:vAlign w:val="top"/>
+          </w:tcPr>
+          <w:p>
+            <w:pPr>
+              <w:keepNext w:val="0"/>
+              <w:spacing w:line="240" w:lineRule="auto" w:before="0" w:after="0"/>
+              <w:ind w:firstLine="0"/>
+              <w:jc w:val="center"/>
+            </w:pPr>
+            <w:r/>
+            <w:r>
+              <w:rPr>
+                <w:rFonts w:ascii="Times New Roman" w:hAnsi="Times New Roman" w:cs="Times New Roman" w:eastAsia="Times New Roman"/>
+                <w:b w:val="0"/>
+                <w:i w:val="0"/>
+                <w:sz w:val="22"/>
+              </w:rPr>
+              <w:t>Низкая</w:t>
+            </w:r>
+          </w:p>
+        </w:tc>
+      </w:tr>
+      <w:tr>
+        <w:trPr>
+          <w:cantSplit/>
+        </w:trPr>
+        <w:tc>
+          <w:tcPr>
+            <w:tcW w:type="dxa" w:w="964"/>
+            <w:vAlign w:val="top"/>
+          </w:tcPr>
+          <w:p>
+            <w:pPr>
+              <w:keepNext w:val="0"/>
+              <w:spacing w:line="240" w:lineRule="auto" w:before="0" w:after="0"/>
+              <w:ind w:firstLine="0"/>
+              <w:jc w:val="center"/>
+            </w:pPr>
+            <w:r/>
+            <w:r>
+              <w:rPr>
+                <w:rFonts w:ascii="Times New Roman" w:hAnsi="Times New Roman" w:cs="Times New Roman" w:eastAsia="Times New Roman"/>
+                <w:b w:val="0"/>
+                <w:i w:val="0"/>
+                <w:sz w:val="22"/>
+              </w:rPr>
+              <w:t>F-33</w:t>
+            </w:r>
+          </w:p>
+          <w:p>
+            <w:pPr>
+              <w:keepNext w:val="0"/>
+              <w:spacing w:line="240" w:lineRule="auto" w:before="0" w:after="0"/>
+              <w:ind w:firstLine="0"/>
+              <w:jc w:val="center"/>
+            </w:pPr>
+            <w:r>
+              <w:rPr>
+                <w:rFonts w:ascii="Times New Roman" w:hAnsi="Times New Roman" w:cs="Times New Roman" w:eastAsia="Times New Roman"/>
+                <w:b w:val="0"/>
+                <w:i w:val="0"/>
+                <w:sz w:val="22"/>
+              </w:rPr>
+              <w:t>(нов.)</w:t>
+            </w:r>
+          </w:p>
+        </w:tc>
+        <w:tc>
+          <w:tcPr>
+            <w:tcW w:type="dxa" w:w="3118"/>
+            <w:vAlign w:val="top"/>
+          </w:tcPr>
+          <w:p>
+            <w:pPr>
+              <w:keepNext w:val="0"/>
+              <w:spacing w:line="240" w:lineRule="auto" w:before="0" w:after="0"/>
+              <w:ind w:firstLine="0"/>
+              <w:jc w:val="left"/>
+            </w:pPr>
+            <w:r/>
+            <w:r>
+              <w:rPr>
+                <w:rFonts w:ascii="Times New Roman" w:hAnsi="Times New Roman" w:cs="Times New Roman" w:eastAsia="Times New Roman"/>
+                <w:b/>
+                <w:i w:val="0"/>
+                <w:sz w:val="22"/>
+              </w:rPr>
+              <w:t>Система должна позволять клиенту согласовать или отклонить доп. работы по ссылке из SMS; ответ автоматически фиксируется в заказе</w:t>
+            </w:r>
+          </w:p>
+        </w:tc>
+        <w:tc>
+          <w:tcPr>
+            <w:tcW w:type="dxa" w:w="1417"/>
+            <w:vAlign w:val="top"/>
+          </w:tcPr>
+          <w:p>
+            <w:pPr>
+              <w:keepNext w:val="0"/>
+              <w:spacing w:line="240" w:lineRule="auto" w:before="0" w:after="0"/>
+              <w:ind w:firstLine="0"/>
+              <w:jc w:val="center"/>
+            </w:pPr>
+            <w:r/>
+            <w:r>
+              <w:rPr>
+                <w:rFonts w:ascii="Times New Roman" w:hAnsi="Times New Roman" w:cs="Times New Roman" w:eastAsia="Times New Roman"/>
+                <w:b w:val="0"/>
+                <w:i w:val="0"/>
+                <w:sz w:val="22"/>
+              </w:rPr>
+              <w:t>Средний</w:t>
+            </w:r>
+          </w:p>
+        </w:tc>
+        <w:tc>
+          <w:tcPr>
+            <w:tcW w:type="dxa" w:w="1871"/>
+            <w:vAlign w:val="top"/>
+          </w:tcPr>
+          <w:p>
+            <w:pPr>
+              <w:keepNext w:val="0"/>
+              <w:spacing w:line="240" w:lineRule="auto" w:before="0" w:after="0"/>
+              <w:ind w:firstLine="0"/>
+              <w:jc w:val="center"/>
+            </w:pPr>
+            <w:r/>
+            <w:r>
+              <w:rPr>
+                <w:rFonts w:ascii="Times New Roman" w:hAnsi="Times New Roman" w:cs="Times New Roman" w:eastAsia="Times New Roman"/>
+                <w:b w:val="0"/>
+                <w:i w:val="0"/>
+                <w:sz w:val="22"/>
+              </w:rPr>
+              <w:t>Высокая</w:t>
+            </w:r>
+          </w:p>
+        </w:tc>
+        <w:tc>
+          <w:tcPr>
+            <w:tcW w:type="dxa" w:w="1984"/>
+            <w:vAlign w:val="top"/>
+          </w:tcPr>
+          <w:p>
+            <w:pPr>
+              <w:keepNext w:val="0"/>
+              <w:spacing w:line="240" w:lineRule="auto" w:before="0" w:after="0"/>
+              <w:ind w:firstLine="0"/>
+              <w:jc w:val="center"/>
+            </w:pPr>
+            <w:r/>
+            <w:r>
+              <w:rPr>
+                <w:rFonts w:ascii="Times New Roman" w:hAnsi="Times New Roman" w:cs="Times New Roman" w:eastAsia="Times New Roman"/>
+                <w:b w:val="0"/>
+                <w:i w:val="0"/>
+                <w:sz w:val="22"/>
+              </w:rPr>
+              <w:t>Высокая</w:t>
+            </w:r>
+          </w:p>
+        </w:tc>
+      </w:tr>
+      <w:tr>
+        <w:trPr>
+          <w:cantSplit/>
+        </w:trPr>
+        <w:tc>
+          <w:tcPr>
+            <w:tcW w:type="dxa" w:w="964"/>
+            <w:vAlign w:val="top"/>
+          </w:tcPr>
+          <w:p>
+            <w:pPr>
+              <w:keepNext w:val="0"/>
+              <w:spacing w:line="240" w:lineRule="auto" w:before="0" w:after="0"/>
+              <w:ind w:firstLine="0"/>
+              <w:jc w:val="center"/>
+            </w:pPr>
+            <w:r/>
+            <w:r>
+              <w:rPr>
+                <w:rFonts w:ascii="Times New Roman" w:hAnsi="Times New Roman" w:cs="Times New Roman" w:eastAsia="Times New Roman"/>
+                <w:b w:val="0"/>
+                <w:i w:val="0"/>
+                <w:sz w:val="22"/>
+              </w:rPr>
+              <w:t>F-34</w:t>
+            </w:r>
+          </w:p>
+          <w:p>
+            <w:pPr>
+              <w:keepNext w:val="0"/>
+              <w:spacing w:line="240" w:lineRule="auto" w:before="0" w:after="0"/>
+              <w:ind w:firstLine="0"/>
+              <w:jc w:val="center"/>
+            </w:pPr>
+            <w:r>
+              <w:rPr>
+                <w:rFonts w:ascii="Times New Roman" w:hAnsi="Times New Roman" w:cs="Times New Roman" w:eastAsia="Times New Roman"/>
+                <w:b w:val="0"/>
+                <w:i w:val="0"/>
+                <w:sz w:val="22"/>
+              </w:rPr>
+              <w:t>(нов.)</w:t>
+            </w:r>
+          </w:p>
+        </w:tc>
+        <w:tc>
+          <w:tcPr>
+            <w:tcW w:type="dxa" w:w="3118"/>
+            <w:vAlign w:val="top"/>
+          </w:tcPr>
+          <w:p>
+            <w:pPr>
+              <w:keepNext w:val="0"/>
+              <w:spacing w:line="240" w:lineRule="auto" w:before="0" w:after="0"/>
+              <w:ind w:firstLine="0"/>
+              <w:jc w:val="left"/>
+            </w:pPr>
+            <w:r/>
+            <w:r>
+              <w:rPr>
+                <w:rFonts w:ascii="Times New Roman" w:hAnsi="Times New Roman" w:cs="Times New Roman" w:eastAsia="Times New Roman"/>
+                <w:b/>
+                <w:i w:val="0"/>
+                <w:sz w:val="22"/>
+              </w:rPr>
+              <w:t>Система должна отправлять клиенту электронную копию квитанции и кассового чека (ссылка в SMS или по e-mail)</w:t>
+            </w:r>
+          </w:p>
+        </w:tc>
+        <w:tc>
+          <w:tcPr>
+            <w:tcW w:type="dxa" w:w="1417"/>
+            <w:vAlign w:val="top"/>
+          </w:tcPr>
+          <w:p>
+            <w:pPr>
+              <w:keepNext w:val="0"/>
+              <w:spacing w:line="240" w:lineRule="auto" w:before="0" w:after="0"/>
+              <w:ind w:firstLine="0"/>
+              <w:jc w:val="center"/>
+            </w:pPr>
+            <w:r/>
+            <w:r>
+              <w:rPr>
+                <w:rFonts w:ascii="Times New Roman" w:hAnsi="Times New Roman" w:cs="Times New Roman" w:eastAsia="Times New Roman"/>
+                <w:b w:val="0"/>
+                <w:i w:val="0"/>
+                <w:sz w:val="22"/>
+              </w:rPr>
+              <w:t>Низкий</w:t>
             </w:r>
           </w:p>
         </w:tc>
@@ -15651,7 +17245,7 @@
           <w:i w:val="0"/>
           <w:sz w:val="28"/>
         </w:rPr>
-        <w:t>Итого спецификация содержит 53 требований: 30 функциональных, 5 к удобству использования, 5 к надёжности, 4 к производительности, 3 к поддерживаемости и 6 ограничений.</w:t>
+        <w:t>Итого спецификация содержит 57 требований: 34 функциональных, 5 к удобству использования, 5 к надёжности, 4 к производительности, 3 к поддерживаемости и 6 ограничений.</w:t>
       </w:r>
     </w:p>
     <w:p>
@@ -15686,7 +17280,7 @@
           <w:i w:val="0"/>
           <w:sz w:val="28"/>
         </w:rPr>
-        <w:t>В ходе работы изучена нотация BPMN 2.0 и построены модели бизнес-процессов автосервиса: модель основного бизнес-процесса «Обслуживание заказа клиента автосервиса» и пять детальных моделей процессов, соответствующих блокам декомпозиции A1–A5 диаграммы IDEF0 из работы №1.</w:t>
+        <w:t>В ходе работы изучена нотация BPMN 2.0 и построены модели бизнес-процессов автосервиса: модель основного бизнес-процесса «Обслуживание заказа клиента автосервиса», пять детальных моделей процессов, соответствующих блокам декомпозиции A1–A5 диаграммы IDEF0 из работы №1, и модель процесса с точки зрения клиента, соответствующая его диаграмме IDEF0.</w:t>
       </w:r>
     </w:p>
     <w:p>
@@ -15703,7 +17297,7 @@
           <w:i w:val="0"/>
           <w:sz w:val="28"/>
         </w:rPr>
-        <w:t>В отличие от функциональной модели IDEF0, BPMN-модели показали порядок выполнения действий, точки принятия решений (шлюзы), ожидания событий (таймеры, сообщения), параллельные ветви и взаимодействие с клиентом. Выделение дорожки «ИС автосервиса» позволило явно определить действия, выполняемые системой. На основе анализа моделей спецификация требований FURPS+ уточнена: добавлено 15 новых требований (12 функциональных, по одному к удобству использования, надёжности и производительности) и изменено 6 требований, в том числе повышены приоритеты требований к уведомлениям клиента, контролю пересечений в графике и взаимодействию с ККТ.</w:t>
+        <w:t>В отличие от функциональной модели IDEF0, BPMN-модели показали порядок выполнения действий, точки принятия решений (шлюзы), ожидания событий (таймеры, сообщения), параллельные ветви и взаимодействие с клиентом. Выделение дорожки «ИС автосервиса» позволило явно определить действия, выполняемые системой, а модель клиента – требования к взаимодействию клиента с ИС (онлайн-запись, напоминания, согласование доп. работ из SMS, электронная квитанция). На основе анализа моделей спецификация требований FURPS+ уточнена: добавлено 19 новых требований и изменено 7, в том числе повышены приоритеты требований к уведомлениям клиента, напоминаниям о ТО, контролю пересечений в графике и взаимодействию с ККТ.</w:t>
       </w:r>
     </w:p>
     <w:sectPr>

</xml_diff>